<commit_message>
feat: complete multi-category AI, customizable dashboard, multi-company switcher, bank account lifecycle, and UI polish
</commit_message>
<xml_diff>
--- a/docs/blynt_Jira_and_Confluence_Workflow.docx
+++ b/docs/blynt_Jira_and_Confluence_Workflow.docx
@@ -605,7 +605,7 @@
           <w:rFonts w:ascii="Segoe UI" w:hAnsi="Segoe UI"/>
           <w:b/>
         </w:rPr>
-        <w:t>4. Quality Gatekeepers: Definition of Ready &amp; Definition of Done</w:t>
+        <w:t>4. Quality Gatekeepers: Definition of Ready, Review Protocol &amp; Definition of Done</w:t>
       </w:r>
     </w:p>
     <w:p>
@@ -642,6 +642,18 @@
           <w:rFonts w:ascii="Segoe UI" w:hAnsi="Segoe UI"/>
         </w:rPr>
         <w:t>4.3 Definition of Done (DoD) Sign-Off Criteria</w:t>
+      </w:r>
+    </w:p>
+    <w:p>
+      <w:pPr>
+        <w:pStyle w:val="ListBullet"/>
+        <w:spacing w:before="20" w:after="40"/>
+      </w:pPr>
+      <w:r>
+        <w:rPr>
+          <w:rFonts w:ascii="Segoe UI" w:hAnsi="Segoe UI"/>
+        </w:rPr>
+        <w:t>4.4 Formal Peer Review &amp; Quality Sign-Off Governance</w:t>
       </w:r>
     </w:p>
     <w:p>
@@ -773,6 +785,18 @@
           <w:rFonts w:ascii="Segoe UI" w:hAnsi="Segoe UI"/>
         </w:rPr>
         <w:t>5.4 Post-Mortem Incident Template</w:t>
+      </w:r>
+    </w:p>
+    <w:p>
+      <w:pPr>
+        <w:pStyle w:val="ListBullet"/>
+        <w:spacing w:before="20" w:after="40"/>
+      </w:pPr>
+      <w:r>
+        <w:rPr>
+          <w:rFonts w:ascii="Segoe UI" w:hAnsi="Segoe UI"/>
+        </w:rPr>
+        <w:t>5.5 Standard Jira Issue Description "Review &amp; Approval" Template</w:t>
       </w:r>
     </w:p>
     <w:p>
@@ -3692,6 +3716,590 @@
         </w:rPr>
         <w:t>[ ] Audit log events verified for any new mutating action.</w:t>
       </w:r>
+    </w:p>
+    <w:p>
+      <w:pPr>
+        <w:keepNext/>
+        <w:spacing w:before="280" w:after="80"/>
+      </w:pPr>
+      <w:r>
+        <w:rPr>
+          <w:rFonts w:ascii="Segoe UI" w:hAnsi="Segoe UI"/>
+          <w:b/>
+          <w:color w:val="162D5F"/>
+          <w:sz w:val="26"/>
+        </w:rPr>
+        <w:t>4.4 Formal Peer Review &amp; Quality Sign-Off Governance</w:t>
+      </w:r>
+    </w:p>
+    <w:p>
+      <w:pPr>
+        <w:spacing w:before="40" w:after="80" w:line="276" w:lineRule="auto"/>
+      </w:pPr>
+      <w:r>
+        <w:rPr>
+          <w:rFonts w:ascii="Segoe UI" w:hAnsi="Segoe UI"/>
+        </w:rPr>
+        <w:t>To uphold mathematical invariants, zero-drift floating-point calculations, and multi-tenant isolation, every Jira Story or Task must complete a mandatory four-tier Review &amp; Approval gate before closure:</w:t>
+      </w:r>
+    </w:p>
+    <w:tbl>
+      <w:tblPr>
+        <w:tblW w:type="auto" w:w="0"/>
+        <w:jc w:val="center"/>
+        <w:tblLook w:firstColumn="1" w:firstRow="1" w:lastColumn="0" w:lastRow="0" w:noHBand="0" w:noVBand="1" w:val="04A0"/>
+      </w:tblPr>
+      <w:tblGrid>
+        <w:gridCol w:w="2412"/>
+        <w:gridCol w:w="2412"/>
+        <w:gridCol w:w="2412"/>
+        <w:gridCol w:w="2412"/>
+      </w:tblGrid>
+      <w:tr>
+        <w:tc>
+          <w:tcPr>
+            <w:tcW w:type="dxa" w:w="2412"/>
+            <w:tcMar>
+              <w:top w:w="65" w:type="dxa"/>
+              <w:bottom w:w="65" w:type="dxa"/>
+              <w:left w:w="95" w:type="dxa"/>
+              <w:right w:w="95" w:type="dxa"/>
+            </w:tcMar>
+            <w:shd w:fill="162D5F"/>
+          </w:tcPr>
+          <w:p>
+            <w:pPr>
+              <w:spacing w:before="40" w:after="40"/>
+            </w:pPr>
+            <w:r>
+              <w:rPr>
+                <w:rFonts w:ascii="Segoe UI" w:hAnsi="Segoe UI"/>
+                <w:b/>
+                <w:color w:val="FFFFFF"/>
+                <w:sz w:val="19"/>
+              </w:rPr>
+              <w:t>Review Tier</w:t>
+            </w:r>
+          </w:p>
+        </w:tc>
+        <w:tc>
+          <w:tcPr>
+            <w:tcW w:type="dxa" w:w="2412"/>
+            <w:tcMar>
+              <w:top w:w="65" w:type="dxa"/>
+              <w:bottom w:w="65" w:type="dxa"/>
+              <w:left w:w="95" w:type="dxa"/>
+              <w:right w:w="95" w:type="dxa"/>
+            </w:tcMar>
+            <w:shd w:fill="162D5F"/>
+          </w:tcPr>
+          <w:p>
+            <w:pPr>
+              <w:spacing w:before="40" w:after="40"/>
+            </w:pPr>
+            <w:r>
+              <w:rPr>
+                <w:rFonts w:ascii="Segoe UI" w:hAnsi="Segoe UI"/>
+                <w:b/>
+                <w:color w:val="FFFFFF"/>
+                <w:sz w:val="19"/>
+              </w:rPr>
+              <w:t>Gatekeeper / Approver</w:t>
+            </w:r>
+          </w:p>
+        </w:tc>
+        <w:tc>
+          <w:tcPr>
+            <w:tcW w:type="dxa" w:w="2412"/>
+            <w:tcMar>
+              <w:top w:w="65" w:type="dxa"/>
+              <w:bottom w:w="65" w:type="dxa"/>
+              <w:left w:w="95" w:type="dxa"/>
+              <w:right w:w="95" w:type="dxa"/>
+            </w:tcMar>
+            <w:shd w:fill="162D5F"/>
+          </w:tcPr>
+          <w:p>
+            <w:pPr>
+              <w:spacing w:before="40" w:after="40"/>
+            </w:pPr>
+            <w:r>
+              <w:rPr>
+                <w:rFonts w:ascii="Segoe UI" w:hAnsi="Segoe UI"/>
+                <w:b/>
+                <w:color w:val="FFFFFF"/>
+                <w:sz w:val="19"/>
+              </w:rPr>
+              <w:t>Mandatory Verification Focus</w:t>
+            </w:r>
+          </w:p>
+        </w:tc>
+        <w:tc>
+          <w:tcPr>
+            <w:tcW w:type="dxa" w:w="2412"/>
+            <w:tcMar>
+              <w:top w:w="65" w:type="dxa"/>
+              <w:bottom w:w="65" w:type="dxa"/>
+              <w:left w:w="95" w:type="dxa"/>
+              <w:right w:w="95" w:type="dxa"/>
+            </w:tcMar>
+            <w:shd w:fill="162D5F"/>
+          </w:tcPr>
+          <w:p>
+            <w:pPr>
+              <w:spacing w:before="40" w:after="40"/>
+            </w:pPr>
+            <w:r>
+              <w:rPr>
+                <w:rFonts w:ascii="Segoe UI" w:hAnsi="Segoe UI"/>
+                <w:b/>
+                <w:color w:val="FFFFFF"/>
+                <w:sz w:val="19"/>
+              </w:rPr>
+              <w:t>Sign-Off Artifact</w:t>
+            </w:r>
+          </w:p>
+        </w:tc>
+      </w:tr>
+      <w:tr>
+        <w:tc>
+          <w:tcPr>
+            <w:tcW w:type="dxa" w:w="2412"/>
+            <w:tcMar>
+              <w:top w:w="65" w:type="dxa"/>
+              <w:bottom w:w="65" w:type="dxa"/>
+              <w:left w:w="95" w:type="dxa"/>
+              <w:right w:w="95" w:type="dxa"/>
+            </w:tcMar>
+            <w:shd w:fill="F8FAFC"/>
+          </w:tcPr>
+          <w:p>
+            <w:pPr>
+              <w:spacing w:before="40" w:after="40"/>
+            </w:pPr>
+            <w:r>
+              <w:rPr>
+                <w:rFonts w:ascii="Segoe UI" w:hAnsi="Segoe UI"/>
+                <w:b/>
+                <w:sz w:val="18"/>
+              </w:rPr>
+              <w:t>Tier 1: Peer Code Review</w:t>
+            </w:r>
+          </w:p>
+        </w:tc>
+        <w:tc>
+          <w:tcPr>
+            <w:tcW w:type="dxa" w:w="2412"/>
+            <w:tcMar>
+              <w:top w:w="65" w:type="dxa"/>
+              <w:bottom w:w="65" w:type="dxa"/>
+              <w:left w:w="95" w:type="dxa"/>
+              <w:right w:w="95" w:type="dxa"/>
+            </w:tcMar>
+            <w:shd w:fill="F8FAFC"/>
+          </w:tcPr>
+          <w:p>
+            <w:pPr>
+              <w:spacing w:before="40" w:after="40"/>
+            </w:pPr>
+            <w:r>
+              <w:rPr>
+                <w:rFonts w:ascii="Segoe UI" w:hAnsi="Segoe UI"/>
+                <w:sz w:val="18"/>
+              </w:rPr>
+              <w:t>2 Senior Engineers</w:t>
+            </w:r>
+          </w:p>
+        </w:tc>
+        <w:tc>
+          <w:tcPr>
+            <w:tcW w:type="dxa" w:w="2412"/>
+            <w:tcMar>
+              <w:top w:w="65" w:type="dxa"/>
+              <w:bottom w:w="65" w:type="dxa"/>
+              <w:left w:w="95" w:type="dxa"/>
+              <w:right w:w="95" w:type="dxa"/>
+            </w:tcMar>
+            <w:shd w:fill="F8FAFC"/>
+          </w:tcPr>
+          <w:p>
+            <w:pPr>
+              <w:spacing w:before="40" w:after="40"/>
+            </w:pPr>
+            <w:r>
+              <w:rPr>
+                <w:rFonts w:ascii="Segoe UI" w:hAnsi="Segoe UI"/>
+                <w:sz w:val="18"/>
+              </w:rPr>
+              <w:t>Strict TypeScript typing, no floating-point math on currencies, domain exception ergonomics, no unhandled async rejections.</w:t>
+            </w:r>
+          </w:p>
+        </w:tc>
+        <w:tc>
+          <w:tcPr>
+            <w:tcW w:type="dxa" w:w="2412"/>
+            <w:tcMar>
+              <w:top w:w="65" w:type="dxa"/>
+              <w:bottom w:w="65" w:type="dxa"/>
+              <w:left w:w="95" w:type="dxa"/>
+              <w:right w:w="95" w:type="dxa"/>
+            </w:tcMar>
+            <w:shd w:fill="F8FAFC"/>
+          </w:tcPr>
+          <w:p>
+            <w:pPr>
+              <w:spacing w:before="40" w:after="40"/>
+            </w:pPr>
+            <w:r>
+              <w:rPr>
+                <w:rFonts w:ascii="Segoe UI" w:hAnsi="Segoe UI"/>
+                <w:sz w:val="18"/>
+              </w:rPr>
+              <w:t>GitHub PR Approvals</w:t>
+            </w:r>
+          </w:p>
+        </w:tc>
+      </w:tr>
+      <w:tr>
+        <w:tc>
+          <w:tcPr>
+            <w:tcW w:type="dxa" w:w="2412"/>
+            <w:tcMar>
+              <w:top w:w="65" w:type="dxa"/>
+              <w:bottom w:w="65" w:type="dxa"/>
+              <w:left w:w="95" w:type="dxa"/>
+              <w:right w:w="95" w:type="dxa"/>
+            </w:tcMar>
+            <w:shd w:fill="FFFFFF"/>
+          </w:tcPr>
+          <w:p>
+            <w:pPr>
+              <w:spacing w:before="40" w:after="40"/>
+            </w:pPr>
+            <w:r>
+              <w:rPr>
+                <w:rFonts w:ascii="Segoe UI" w:hAnsi="Segoe UI"/>
+                <w:b/>
+                <w:sz w:val="18"/>
+              </w:rPr>
+              <w:t>Tier 2: Invariant &amp; Security Review</w:t>
+            </w:r>
+          </w:p>
+        </w:tc>
+        <w:tc>
+          <w:tcPr>
+            <w:tcW w:type="dxa" w:w="2412"/>
+            <w:tcMar>
+              <w:top w:w="65" w:type="dxa"/>
+              <w:bottom w:w="65" w:type="dxa"/>
+              <w:left w:w="95" w:type="dxa"/>
+              <w:right w:w="95" w:type="dxa"/>
+            </w:tcMar>
+            <w:shd w:fill="FFFFFF"/>
+          </w:tcPr>
+          <w:p>
+            <w:pPr>
+              <w:spacing w:before="40" w:after="40"/>
+            </w:pPr>
+            <w:r>
+              <w:rPr>
+                <w:rFonts w:ascii="Segoe UI" w:hAnsi="Segoe UI"/>
+                <w:sz w:val="18"/>
+              </w:rPr>
+              <w:t>Lead Architect / SecOps</w:t>
+            </w:r>
+          </w:p>
+        </w:tc>
+        <w:tc>
+          <w:tcPr>
+            <w:tcW w:type="dxa" w:w="2412"/>
+            <w:tcMar>
+              <w:top w:w="65" w:type="dxa"/>
+              <w:bottom w:w="65" w:type="dxa"/>
+              <w:left w:w="95" w:type="dxa"/>
+              <w:right w:w="95" w:type="dxa"/>
+            </w:tcMar>
+            <w:shd w:fill="FFFFFF"/>
+          </w:tcPr>
+          <w:p>
+            <w:pPr>
+              <w:spacing w:before="40" w:after="40"/>
+            </w:pPr>
+            <w:r>
+              <w:rPr>
+                <w:rFonts w:ascii="Segoe UI" w:hAnsi="Segoe UI"/>
+                <w:sz w:val="18"/>
+              </w:rPr>
+              <w:t>Debit/Credit balance equality (</w:t>
+            </w:r>
+            <w:r>
+              <w:rPr>
+                <w:rFonts w:ascii="Consolas" w:hAnsi="Consolas"/>
+                <w:color w:val="B42828"/>
+                <w:sz w:val="18"/>
+              </w:rPr>
+              <w:t>sum(dr) === sum(cr)</w:t>
+            </w:r>
+            <w:r>
+              <w:rPr>
+                <w:rFonts w:ascii="Segoe UI" w:hAnsi="Segoe UI"/>
+                <w:sz w:val="18"/>
+              </w:rPr>
+              <w:t xml:space="preserve">), multi-tenant </w:t>
+            </w:r>
+            <w:r>
+              <w:rPr>
+                <w:rFonts w:ascii="Consolas" w:hAnsi="Consolas"/>
+                <w:color w:val="B42828"/>
+                <w:sz w:val="18"/>
+              </w:rPr>
+              <w:t>organizationId</w:t>
+            </w:r>
+            <w:r>
+              <w:rPr>
+                <w:rFonts w:ascii="Segoe UI" w:hAnsi="Segoe UI"/>
+                <w:sz w:val="18"/>
+              </w:rPr>
+              <w:t xml:space="preserve"> isolation, audit logging on mutating calls.</w:t>
+            </w:r>
+          </w:p>
+        </w:tc>
+        <w:tc>
+          <w:tcPr>
+            <w:tcW w:type="dxa" w:w="2412"/>
+            <w:tcMar>
+              <w:top w:w="65" w:type="dxa"/>
+              <w:bottom w:w="65" w:type="dxa"/>
+              <w:left w:w="95" w:type="dxa"/>
+              <w:right w:w="95" w:type="dxa"/>
+            </w:tcMar>
+            <w:shd w:fill="FFFFFF"/>
+          </w:tcPr>
+          <w:p>
+            <w:pPr>
+              <w:spacing w:before="40" w:after="40"/>
+            </w:pPr>
+            <w:r>
+              <w:rPr>
+                <w:rFonts w:ascii="Segoe UI" w:hAnsi="Segoe UI"/>
+                <w:sz w:val="18"/>
+              </w:rPr>
+              <w:t>Jira Sign-off Comment</w:t>
+            </w:r>
+          </w:p>
+        </w:tc>
+      </w:tr>
+      <w:tr>
+        <w:tc>
+          <w:tcPr>
+            <w:tcW w:type="dxa" w:w="2412"/>
+            <w:tcMar>
+              <w:top w:w="65" w:type="dxa"/>
+              <w:bottom w:w="65" w:type="dxa"/>
+              <w:left w:w="95" w:type="dxa"/>
+              <w:right w:w="95" w:type="dxa"/>
+            </w:tcMar>
+            <w:shd w:fill="F8FAFC"/>
+          </w:tcPr>
+          <w:p>
+            <w:pPr>
+              <w:spacing w:before="40" w:after="40"/>
+            </w:pPr>
+            <w:r>
+              <w:rPr>
+                <w:rFonts w:ascii="Segoe UI" w:hAnsi="Segoe UI"/>
+                <w:b/>
+                <w:sz w:val="18"/>
+              </w:rPr>
+              <w:t>Tier 3: QA &amp; Automated Testing</w:t>
+            </w:r>
+          </w:p>
+        </w:tc>
+        <w:tc>
+          <w:tcPr>
+            <w:tcW w:type="dxa" w:w="2412"/>
+            <w:tcMar>
+              <w:top w:w="65" w:type="dxa"/>
+              <w:bottom w:w="65" w:type="dxa"/>
+              <w:left w:w="95" w:type="dxa"/>
+              <w:right w:w="95" w:type="dxa"/>
+            </w:tcMar>
+            <w:shd w:fill="F8FAFC"/>
+          </w:tcPr>
+          <w:p>
+            <w:pPr>
+              <w:spacing w:before="40" w:after="40"/>
+            </w:pPr>
+            <w:r>
+              <w:rPr>
+                <w:rFonts w:ascii="Segoe UI" w:hAnsi="Segoe UI"/>
+                <w:sz w:val="18"/>
+              </w:rPr>
+              <w:t>QA Lead / Test Engineer</w:t>
+            </w:r>
+          </w:p>
+        </w:tc>
+        <w:tc>
+          <w:tcPr>
+            <w:tcW w:type="dxa" w:w="2412"/>
+            <w:tcMar>
+              <w:top w:w="65" w:type="dxa"/>
+              <w:bottom w:w="65" w:type="dxa"/>
+              <w:left w:w="95" w:type="dxa"/>
+              <w:right w:w="95" w:type="dxa"/>
+            </w:tcMar>
+            <w:shd w:fill="F8FAFC"/>
+          </w:tcPr>
+          <w:p>
+            <w:pPr>
+              <w:spacing w:before="40" w:after="40"/>
+            </w:pPr>
+            <w:r>
+              <w:rPr>
+                <w:rFonts w:ascii="Segoe UI" w:hAnsi="Segoe UI"/>
+                <w:sz w:val="18"/>
+              </w:rPr>
+              <w:t>100% test pass on all 26 test suites (127 tests), edge-case validation, idempotency testing, API response status checks.</w:t>
+            </w:r>
+          </w:p>
+        </w:tc>
+        <w:tc>
+          <w:tcPr>
+            <w:tcW w:type="dxa" w:w="2412"/>
+            <w:tcMar>
+              <w:top w:w="65" w:type="dxa"/>
+              <w:bottom w:w="65" w:type="dxa"/>
+              <w:left w:w="95" w:type="dxa"/>
+              <w:right w:w="95" w:type="dxa"/>
+            </w:tcMar>
+            <w:shd w:fill="F8FAFC"/>
+          </w:tcPr>
+          <w:p>
+            <w:pPr>
+              <w:spacing w:before="40" w:after="40"/>
+            </w:pPr>
+            <w:r>
+              <w:rPr>
+                <w:rFonts w:ascii="Segoe UI" w:hAnsi="Segoe UI"/>
+                <w:sz w:val="18"/>
+              </w:rPr>
+              <w:t>Jira Test Run Execution Record</w:t>
+            </w:r>
+          </w:p>
+        </w:tc>
+      </w:tr>
+      <w:tr>
+        <w:tc>
+          <w:tcPr>
+            <w:tcW w:type="dxa" w:w="2412"/>
+            <w:tcMar>
+              <w:top w:w="65" w:type="dxa"/>
+              <w:bottom w:w="65" w:type="dxa"/>
+              <w:left w:w="95" w:type="dxa"/>
+              <w:right w:w="95" w:type="dxa"/>
+            </w:tcMar>
+            <w:shd w:fill="FFFFFF"/>
+          </w:tcPr>
+          <w:p>
+            <w:pPr>
+              <w:spacing w:before="40" w:after="40"/>
+            </w:pPr>
+            <w:r>
+              <w:rPr>
+                <w:rFonts w:ascii="Segoe UI" w:hAnsi="Segoe UI"/>
+                <w:b/>
+                <w:sz w:val="18"/>
+              </w:rPr>
+              <w:t>Tier 4: Product Owner Acceptance</w:t>
+            </w:r>
+          </w:p>
+        </w:tc>
+        <w:tc>
+          <w:tcPr>
+            <w:tcW w:type="dxa" w:w="2412"/>
+            <w:tcMar>
+              <w:top w:w="65" w:type="dxa"/>
+              <w:bottom w:w="65" w:type="dxa"/>
+              <w:left w:w="95" w:type="dxa"/>
+              <w:right w:w="95" w:type="dxa"/>
+            </w:tcMar>
+            <w:shd w:fill="FFFFFF"/>
+          </w:tcPr>
+          <w:p>
+            <w:pPr>
+              <w:spacing w:before="40" w:after="40"/>
+            </w:pPr>
+            <w:r>
+              <w:rPr>
+                <w:rFonts w:ascii="Segoe UI" w:hAnsi="Segoe UI"/>
+                <w:sz w:val="18"/>
+              </w:rPr>
+              <w:t>Product Owner</w:t>
+            </w:r>
+          </w:p>
+        </w:tc>
+        <w:tc>
+          <w:tcPr>
+            <w:tcW w:type="dxa" w:w="2412"/>
+            <w:tcMar>
+              <w:top w:w="65" w:type="dxa"/>
+              <w:bottom w:w="65" w:type="dxa"/>
+              <w:left w:w="95" w:type="dxa"/>
+              <w:right w:w="95" w:type="dxa"/>
+            </w:tcMar>
+            <w:shd w:fill="FFFFFF"/>
+          </w:tcPr>
+          <w:p>
+            <w:pPr>
+              <w:spacing w:before="40" w:after="40"/>
+            </w:pPr>
+            <w:r>
+              <w:rPr>
+                <w:rFonts w:ascii="Segoe UI" w:hAnsi="Segoe UI"/>
+                <w:sz w:val="18"/>
+              </w:rPr>
+              <w:t>Business acceptance against Gherkin scenarios in Confluence PRD, UX alignment with design system, user story sign-off.</w:t>
+            </w:r>
+          </w:p>
+        </w:tc>
+        <w:tc>
+          <w:tcPr>
+            <w:tcW w:type="dxa" w:w="2412"/>
+            <w:tcMar>
+              <w:top w:w="65" w:type="dxa"/>
+              <w:bottom w:w="65" w:type="dxa"/>
+              <w:left w:w="95" w:type="dxa"/>
+              <w:right w:w="95" w:type="dxa"/>
+            </w:tcMar>
+            <w:shd w:fill="FFFFFF"/>
+          </w:tcPr>
+          <w:p>
+            <w:pPr>
+              <w:spacing w:before="40" w:after="40"/>
+            </w:pPr>
+            <w:r>
+              <w:rPr>
+                <w:rFonts w:ascii="Segoe UI" w:hAnsi="Segoe UI"/>
+                <w:sz w:val="18"/>
+              </w:rPr>
+              <w:t xml:space="preserve">Jira Status </w:t>
+            </w:r>
+            <w:r>
+              <w:rPr>
+                <w:rFonts w:ascii="Consolas" w:hAnsi="Consolas"/>
+                <w:color w:val="B42828"/>
+                <w:sz w:val="18"/>
+              </w:rPr>
+              <w:t>DONE</w:t>
+            </w:r>
+          </w:p>
+        </w:tc>
+      </w:tr>
+    </w:tbl>
+    <w:p>
+      <w:pPr>
+        <w:spacing w:after="80"/>
+      </w:pPr>
     </w:p>
     <w:p>
       <w:pPr>
@@ -4583,6 +5191,1155 @@
       <w:pPr>
         <w:spacing w:after="80"/>
       </w:pPr>
+    </w:p>
+    <w:p>
+      <w:pPr>
+        <w:keepNext/>
+        <w:spacing w:before="280" w:after="80"/>
+      </w:pPr>
+      <w:r>
+        <w:rPr>
+          <w:rFonts w:ascii="Segoe UI" w:hAnsi="Segoe UI"/>
+          <w:b/>
+          <w:color w:val="162D5F"/>
+          <w:sz w:val="26"/>
+        </w:rPr>
+        <w:t>5.5 Standard Jira Issue Description "Review &amp; Approval" Template</w:t>
+      </w:r>
+    </w:p>
+    <w:p>
+      <w:pPr>
+        <w:spacing w:before="40" w:after="80" w:line="276" w:lineRule="auto"/>
+      </w:pPr>
+      <w:r>
+        <w:rPr>
+          <w:rFonts w:ascii="Segoe UI" w:hAnsi="Segoe UI"/>
+        </w:rPr>
+        <w:t>Every engineering story, task, and bug in Jira must include this standardized Review &amp; Approval matrix embedded in its description:</w:t>
+      </w:r>
+    </w:p>
+    <w:tbl>
+      <w:tblPr>
+        <w:tblW w:type="auto" w:w="0"/>
+        <w:jc w:val="center"/>
+        <w:tblLook w:firstColumn="1" w:firstRow="1" w:lastColumn="0" w:lastRow="0" w:noHBand="0" w:noVBand="1" w:val="04A0"/>
+      </w:tblPr>
+      <w:tblGrid>
+        <w:gridCol w:w="1608"/>
+        <w:gridCol w:w="1608"/>
+        <w:gridCol w:w="1608"/>
+        <w:gridCol w:w="1608"/>
+        <w:gridCol w:w="1608"/>
+        <w:gridCol w:w="1608"/>
+      </w:tblGrid>
+      <w:tr>
+        <w:tc>
+          <w:tcPr>
+            <w:tcW w:type="dxa" w:w="1608"/>
+            <w:tcMar>
+              <w:top w:w="65" w:type="dxa"/>
+              <w:bottom w:w="65" w:type="dxa"/>
+              <w:left w:w="95" w:type="dxa"/>
+              <w:right w:w="95" w:type="dxa"/>
+            </w:tcMar>
+            <w:shd w:fill="162D5F"/>
+          </w:tcPr>
+          <w:p>
+            <w:pPr>
+              <w:spacing w:before="40" w:after="40"/>
+            </w:pPr>
+            <w:r>
+              <w:rPr>
+                <w:rFonts w:ascii="Segoe UI" w:hAnsi="Segoe UI"/>
+                <w:b/>
+                <w:color w:val="FFFFFF"/>
+                <w:sz w:val="19"/>
+              </w:rPr>
+              <w:t>Review Milestone</w:t>
+            </w:r>
+          </w:p>
+        </w:tc>
+        <w:tc>
+          <w:tcPr>
+            <w:tcW w:type="dxa" w:w="1608"/>
+            <w:tcMar>
+              <w:top w:w="65" w:type="dxa"/>
+              <w:bottom w:w="65" w:type="dxa"/>
+              <w:left w:w="95" w:type="dxa"/>
+              <w:right w:w="95" w:type="dxa"/>
+            </w:tcMar>
+            <w:shd w:fill="162D5F"/>
+          </w:tcPr>
+          <w:p>
+            <w:pPr>
+              <w:spacing w:before="40" w:after="40"/>
+            </w:pPr>
+            <w:r>
+              <w:rPr>
+                <w:rFonts w:ascii="Segoe UI" w:hAnsi="Segoe UI"/>
+                <w:b/>
+                <w:color w:val="FFFFFF"/>
+                <w:sz w:val="19"/>
+              </w:rPr>
+              <w:t>Gatekeeper Role</w:t>
+            </w:r>
+          </w:p>
+        </w:tc>
+        <w:tc>
+          <w:tcPr>
+            <w:tcW w:type="dxa" w:w="1608"/>
+            <w:tcMar>
+              <w:top w:w="65" w:type="dxa"/>
+              <w:bottom w:w="65" w:type="dxa"/>
+              <w:left w:w="95" w:type="dxa"/>
+              <w:right w:w="95" w:type="dxa"/>
+            </w:tcMar>
+            <w:shd w:fill="162D5F"/>
+          </w:tcPr>
+          <w:p>
+            <w:pPr>
+              <w:spacing w:before="40" w:after="40"/>
+            </w:pPr>
+            <w:r>
+              <w:rPr>
+                <w:rFonts w:ascii="Segoe UI" w:hAnsi="Segoe UI"/>
+                <w:b/>
+                <w:color w:val="FFFFFF"/>
+                <w:sz w:val="19"/>
+              </w:rPr>
+              <w:t>Sign-Off Status</w:t>
+            </w:r>
+          </w:p>
+        </w:tc>
+        <w:tc>
+          <w:tcPr>
+            <w:tcW w:type="dxa" w:w="1608"/>
+            <w:tcMar>
+              <w:top w:w="65" w:type="dxa"/>
+              <w:bottom w:w="65" w:type="dxa"/>
+              <w:left w:w="95" w:type="dxa"/>
+              <w:right w:w="95" w:type="dxa"/>
+            </w:tcMar>
+            <w:shd w:fill="162D5F"/>
+          </w:tcPr>
+          <w:p>
+            <w:pPr>
+              <w:spacing w:before="40" w:after="40"/>
+            </w:pPr>
+            <w:r>
+              <w:rPr>
+                <w:rFonts w:ascii="Segoe UI" w:hAnsi="Segoe UI"/>
+                <w:b/>
+                <w:color w:val="FFFFFF"/>
+                <w:sz w:val="19"/>
+              </w:rPr>
+              <w:t>Approver Handle</w:t>
+            </w:r>
+          </w:p>
+        </w:tc>
+        <w:tc>
+          <w:tcPr>
+            <w:tcW w:type="dxa" w:w="1608"/>
+            <w:tcMar>
+              <w:top w:w="65" w:type="dxa"/>
+              <w:bottom w:w="65" w:type="dxa"/>
+              <w:left w:w="95" w:type="dxa"/>
+              <w:right w:w="95" w:type="dxa"/>
+            </w:tcMar>
+            <w:shd w:fill="162D5F"/>
+          </w:tcPr>
+          <w:p>
+            <w:pPr>
+              <w:spacing w:before="40" w:after="40"/>
+            </w:pPr>
+            <w:r>
+              <w:rPr>
+                <w:rFonts w:ascii="Segoe UI" w:hAnsi="Segoe UI"/>
+                <w:b/>
+                <w:color w:val="FFFFFF"/>
+                <w:sz w:val="19"/>
+              </w:rPr>
+              <w:t>Date Verified</w:t>
+            </w:r>
+          </w:p>
+        </w:tc>
+        <w:tc>
+          <w:tcPr>
+            <w:tcW w:type="dxa" w:w="1608"/>
+            <w:tcMar>
+              <w:top w:w="65" w:type="dxa"/>
+              <w:bottom w:w="65" w:type="dxa"/>
+              <w:left w:w="95" w:type="dxa"/>
+              <w:right w:w="95" w:type="dxa"/>
+            </w:tcMar>
+            <w:shd w:fill="162D5F"/>
+          </w:tcPr>
+          <w:p>
+            <w:pPr>
+              <w:spacing w:before="40" w:after="40"/>
+            </w:pPr>
+            <w:r>
+              <w:rPr>
+                <w:rFonts w:ascii="Segoe UI" w:hAnsi="Segoe UI"/>
+                <w:b/>
+                <w:color w:val="FFFFFF"/>
+                <w:sz w:val="19"/>
+              </w:rPr>
+              <w:t>Evidence / Link</w:t>
+            </w:r>
+          </w:p>
+        </w:tc>
+      </w:tr>
+      <w:tr>
+        <w:tc>
+          <w:tcPr>
+            <w:tcW w:type="dxa" w:w="1608"/>
+            <w:tcMar>
+              <w:top w:w="65" w:type="dxa"/>
+              <w:bottom w:w="65" w:type="dxa"/>
+              <w:left w:w="95" w:type="dxa"/>
+              <w:right w:w="95" w:type="dxa"/>
+            </w:tcMar>
+            <w:shd w:fill="F8FAFC"/>
+          </w:tcPr>
+          <w:p>
+            <w:pPr>
+              <w:spacing w:before="40" w:after="40"/>
+            </w:pPr>
+            <w:r>
+              <w:rPr>
+                <w:rFonts w:ascii="Segoe UI" w:hAnsi="Segoe UI"/>
+                <w:b/>
+                <w:sz w:val="18"/>
+              </w:rPr>
+              <w:t>1. Peer Code Review</w:t>
+            </w:r>
+          </w:p>
+        </w:tc>
+        <w:tc>
+          <w:tcPr>
+            <w:tcW w:type="dxa" w:w="1608"/>
+            <w:tcMar>
+              <w:top w:w="65" w:type="dxa"/>
+              <w:bottom w:w="65" w:type="dxa"/>
+              <w:left w:w="95" w:type="dxa"/>
+              <w:right w:w="95" w:type="dxa"/>
+            </w:tcMar>
+            <w:shd w:fill="F8FAFC"/>
+          </w:tcPr>
+          <w:p>
+            <w:pPr>
+              <w:spacing w:before="40" w:after="40"/>
+            </w:pPr>
+            <w:r>
+              <w:rPr>
+                <w:rFonts w:ascii="Segoe UI" w:hAnsi="Segoe UI"/>
+                <w:sz w:val="18"/>
+              </w:rPr>
+              <w:t>Senior Engineer 1</w:t>
+            </w:r>
+          </w:p>
+        </w:tc>
+        <w:tc>
+          <w:tcPr>
+            <w:tcW w:type="dxa" w:w="1608"/>
+            <w:tcMar>
+              <w:top w:w="65" w:type="dxa"/>
+              <w:bottom w:w="65" w:type="dxa"/>
+              <w:left w:w="95" w:type="dxa"/>
+              <w:right w:w="95" w:type="dxa"/>
+            </w:tcMar>
+            <w:shd w:fill="F8FAFC"/>
+          </w:tcPr>
+          <w:p>
+            <w:pPr>
+              <w:spacing w:before="40" w:after="40"/>
+            </w:pPr>
+            <w:r>
+              <w:rPr>
+                <w:rFonts w:ascii="Segoe UI" w:hAnsi="Segoe UI"/>
+                <w:sz w:val="18"/>
+              </w:rPr>
+              <w:t>[ ] PENDING / [x] APPROVED</w:t>
+            </w:r>
+          </w:p>
+        </w:tc>
+        <w:tc>
+          <w:tcPr>
+            <w:tcW w:type="dxa" w:w="1608"/>
+            <w:tcMar>
+              <w:top w:w="65" w:type="dxa"/>
+              <w:bottom w:w="65" w:type="dxa"/>
+              <w:left w:w="95" w:type="dxa"/>
+              <w:right w:w="95" w:type="dxa"/>
+            </w:tcMar>
+            <w:shd w:fill="F8FAFC"/>
+          </w:tcPr>
+          <w:p>
+            <w:pPr>
+              <w:spacing w:before="40" w:after="40"/>
+            </w:pPr>
+            <w:r>
+              <w:rPr>
+                <w:rFonts w:ascii="Segoe UI" w:hAnsi="Segoe UI"/>
+                <w:sz w:val="18"/>
+              </w:rPr>
+              <w:t>@dev-lead</w:t>
+            </w:r>
+          </w:p>
+        </w:tc>
+        <w:tc>
+          <w:tcPr>
+            <w:tcW w:type="dxa" w:w="1608"/>
+            <w:tcMar>
+              <w:top w:w="65" w:type="dxa"/>
+              <w:bottom w:w="65" w:type="dxa"/>
+              <w:left w:w="95" w:type="dxa"/>
+              <w:right w:w="95" w:type="dxa"/>
+            </w:tcMar>
+            <w:shd w:fill="F8FAFC"/>
+          </w:tcPr>
+          <w:p>
+            <w:pPr>
+              <w:spacing w:before="40" w:after="40"/>
+            </w:pPr>
+            <w:r>
+              <w:rPr>
+                <w:rFonts w:ascii="Segoe UI" w:hAnsi="Segoe UI"/>
+                <w:sz w:val="18"/>
+              </w:rPr>
+              <w:t>YYYY-MM-DD</w:t>
+            </w:r>
+          </w:p>
+        </w:tc>
+        <w:tc>
+          <w:tcPr>
+            <w:tcW w:type="dxa" w:w="1608"/>
+            <w:tcMar>
+              <w:top w:w="65" w:type="dxa"/>
+              <w:bottom w:w="65" w:type="dxa"/>
+              <w:left w:w="95" w:type="dxa"/>
+              <w:right w:w="95" w:type="dxa"/>
+            </w:tcMar>
+            <w:shd w:fill="F8FAFC"/>
+          </w:tcPr>
+          <w:p>
+            <w:pPr>
+              <w:spacing w:before="40" w:after="40"/>
+            </w:pPr>
+            <w:r>
+              <w:rPr>
+                <w:rFonts w:ascii="Segoe UI" w:hAnsi="Segoe UI"/>
+                <w:sz w:val="18"/>
+              </w:rPr>
+              <w:t>GitHub PR #___</w:t>
+            </w:r>
+          </w:p>
+        </w:tc>
+      </w:tr>
+      <w:tr>
+        <w:tc>
+          <w:tcPr>
+            <w:tcW w:type="dxa" w:w="1608"/>
+            <w:tcMar>
+              <w:top w:w="65" w:type="dxa"/>
+              <w:bottom w:w="65" w:type="dxa"/>
+              <w:left w:w="95" w:type="dxa"/>
+              <w:right w:w="95" w:type="dxa"/>
+            </w:tcMar>
+            <w:shd w:fill="FFFFFF"/>
+          </w:tcPr>
+          <w:p>
+            <w:pPr>
+              <w:spacing w:before="40" w:after="40"/>
+            </w:pPr>
+            <w:r>
+              <w:rPr>
+                <w:rFonts w:ascii="Segoe UI" w:hAnsi="Segoe UI"/>
+                <w:b/>
+                <w:sz w:val="18"/>
+              </w:rPr>
+              <w:t>2. Invariant &amp; Security Review</w:t>
+            </w:r>
+          </w:p>
+        </w:tc>
+        <w:tc>
+          <w:tcPr>
+            <w:tcW w:type="dxa" w:w="1608"/>
+            <w:tcMar>
+              <w:top w:w="65" w:type="dxa"/>
+              <w:bottom w:w="65" w:type="dxa"/>
+              <w:left w:w="95" w:type="dxa"/>
+              <w:right w:w="95" w:type="dxa"/>
+            </w:tcMar>
+            <w:shd w:fill="FFFFFF"/>
+          </w:tcPr>
+          <w:p>
+            <w:pPr>
+              <w:spacing w:before="40" w:after="40"/>
+            </w:pPr>
+            <w:r>
+              <w:rPr>
+                <w:rFonts w:ascii="Segoe UI" w:hAnsi="Segoe UI"/>
+                <w:sz w:val="18"/>
+              </w:rPr>
+              <w:t>Lead Architect</w:t>
+            </w:r>
+          </w:p>
+        </w:tc>
+        <w:tc>
+          <w:tcPr>
+            <w:tcW w:type="dxa" w:w="1608"/>
+            <w:tcMar>
+              <w:top w:w="65" w:type="dxa"/>
+              <w:bottom w:w="65" w:type="dxa"/>
+              <w:left w:w="95" w:type="dxa"/>
+              <w:right w:w="95" w:type="dxa"/>
+            </w:tcMar>
+            <w:shd w:fill="FFFFFF"/>
+          </w:tcPr>
+          <w:p>
+            <w:pPr>
+              <w:spacing w:before="40" w:after="40"/>
+            </w:pPr>
+            <w:r>
+              <w:rPr>
+                <w:rFonts w:ascii="Segoe UI" w:hAnsi="Segoe UI"/>
+                <w:sz w:val="18"/>
+              </w:rPr>
+              <w:t>[ ] PENDING / [x] APPROVED</w:t>
+            </w:r>
+          </w:p>
+        </w:tc>
+        <w:tc>
+          <w:tcPr>
+            <w:tcW w:type="dxa" w:w="1608"/>
+            <w:tcMar>
+              <w:top w:w="65" w:type="dxa"/>
+              <w:bottom w:w="65" w:type="dxa"/>
+              <w:left w:w="95" w:type="dxa"/>
+              <w:right w:w="95" w:type="dxa"/>
+            </w:tcMar>
+            <w:shd w:fill="FFFFFF"/>
+          </w:tcPr>
+          <w:p>
+            <w:pPr>
+              <w:spacing w:before="40" w:after="40"/>
+            </w:pPr>
+            <w:r>
+              <w:rPr>
+                <w:rFonts w:ascii="Segoe UI" w:hAnsi="Segoe UI"/>
+                <w:sz w:val="18"/>
+              </w:rPr>
+              <w:t>@architect</w:t>
+            </w:r>
+          </w:p>
+        </w:tc>
+        <w:tc>
+          <w:tcPr>
+            <w:tcW w:type="dxa" w:w="1608"/>
+            <w:tcMar>
+              <w:top w:w="65" w:type="dxa"/>
+              <w:bottom w:w="65" w:type="dxa"/>
+              <w:left w:w="95" w:type="dxa"/>
+              <w:right w:w="95" w:type="dxa"/>
+            </w:tcMar>
+            <w:shd w:fill="FFFFFF"/>
+          </w:tcPr>
+          <w:p>
+            <w:pPr>
+              <w:spacing w:before="40" w:after="40"/>
+            </w:pPr>
+            <w:r>
+              <w:rPr>
+                <w:rFonts w:ascii="Segoe UI" w:hAnsi="Segoe UI"/>
+                <w:sz w:val="18"/>
+              </w:rPr>
+              <w:t>YYYY-MM-DD</w:t>
+            </w:r>
+          </w:p>
+        </w:tc>
+        <w:tc>
+          <w:tcPr>
+            <w:tcW w:type="dxa" w:w="1608"/>
+            <w:tcMar>
+              <w:top w:w="65" w:type="dxa"/>
+              <w:bottom w:w="65" w:type="dxa"/>
+              <w:left w:w="95" w:type="dxa"/>
+              <w:right w:w="95" w:type="dxa"/>
+            </w:tcMar>
+            <w:shd w:fill="FFFFFF"/>
+          </w:tcPr>
+          <w:p>
+            <w:pPr>
+              <w:spacing w:before="40" w:after="40"/>
+            </w:pPr>
+            <w:r>
+              <w:rPr>
+                <w:rFonts w:ascii="Segoe UI" w:hAnsi="Segoe UI"/>
+                <w:sz w:val="18"/>
+              </w:rPr>
+              <w:t>Invariant Audit</w:t>
+            </w:r>
+          </w:p>
+        </w:tc>
+      </w:tr>
+      <w:tr>
+        <w:tc>
+          <w:tcPr>
+            <w:tcW w:type="dxa" w:w="1608"/>
+            <w:tcMar>
+              <w:top w:w="65" w:type="dxa"/>
+              <w:bottom w:w="65" w:type="dxa"/>
+              <w:left w:w="95" w:type="dxa"/>
+              <w:right w:w="95" w:type="dxa"/>
+            </w:tcMar>
+            <w:shd w:fill="F8FAFC"/>
+          </w:tcPr>
+          <w:p>
+            <w:pPr>
+              <w:spacing w:before="40" w:after="40"/>
+            </w:pPr>
+            <w:r>
+              <w:rPr>
+                <w:rFonts w:ascii="Segoe UI" w:hAnsi="Segoe UI"/>
+                <w:b/>
+                <w:sz w:val="18"/>
+              </w:rPr>
+              <w:t>3. QA &amp; Automated Verification</w:t>
+            </w:r>
+          </w:p>
+        </w:tc>
+        <w:tc>
+          <w:tcPr>
+            <w:tcW w:type="dxa" w:w="1608"/>
+            <w:tcMar>
+              <w:top w:w="65" w:type="dxa"/>
+              <w:bottom w:w="65" w:type="dxa"/>
+              <w:left w:w="95" w:type="dxa"/>
+              <w:right w:w="95" w:type="dxa"/>
+            </w:tcMar>
+            <w:shd w:fill="F8FAFC"/>
+          </w:tcPr>
+          <w:p>
+            <w:pPr>
+              <w:spacing w:before="40" w:after="40"/>
+            </w:pPr>
+            <w:r>
+              <w:rPr>
+                <w:rFonts w:ascii="Segoe UI" w:hAnsi="Segoe UI"/>
+                <w:sz w:val="18"/>
+              </w:rPr>
+              <w:t>QA Lead</w:t>
+            </w:r>
+          </w:p>
+        </w:tc>
+        <w:tc>
+          <w:tcPr>
+            <w:tcW w:type="dxa" w:w="1608"/>
+            <w:tcMar>
+              <w:top w:w="65" w:type="dxa"/>
+              <w:bottom w:w="65" w:type="dxa"/>
+              <w:left w:w="95" w:type="dxa"/>
+              <w:right w:w="95" w:type="dxa"/>
+            </w:tcMar>
+            <w:shd w:fill="F8FAFC"/>
+          </w:tcPr>
+          <w:p>
+            <w:pPr>
+              <w:spacing w:before="40" w:after="40"/>
+            </w:pPr>
+            <w:r>
+              <w:rPr>
+                <w:rFonts w:ascii="Segoe UI" w:hAnsi="Segoe UI"/>
+                <w:sz w:val="18"/>
+              </w:rPr>
+              <w:t>[ ] PENDING / [x] APPROVED</w:t>
+            </w:r>
+          </w:p>
+        </w:tc>
+        <w:tc>
+          <w:tcPr>
+            <w:tcW w:type="dxa" w:w="1608"/>
+            <w:tcMar>
+              <w:top w:w="65" w:type="dxa"/>
+              <w:bottom w:w="65" w:type="dxa"/>
+              <w:left w:w="95" w:type="dxa"/>
+              <w:right w:w="95" w:type="dxa"/>
+            </w:tcMar>
+            <w:shd w:fill="F8FAFC"/>
+          </w:tcPr>
+          <w:p>
+            <w:pPr>
+              <w:spacing w:before="40" w:after="40"/>
+            </w:pPr>
+            <w:r>
+              <w:rPr>
+                <w:rFonts w:ascii="Segoe UI" w:hAnsi="Segoe UI"/>
+                <w:sz w:val="18"/>
+              </w:rPr>
+              <w:t>@qa-lead</w:t>
+            </w:r>
+          </w:p>
+        </w:tc>
+        <w:tc>
+          <w:tcPr>
+            <w:tcW w:type="dxa" w:w="1608"/>
+            <w:tcMar>
+              <w:top w:w="65" w:type="dxa"/>
+              <w:bottom w:w="65" w:type="dxa"/>
+              <w:left w:w="95" w:type="dxa"/>
+              <w:right w:w="95" w:type="dxa"/>
+            </w:tcMar>
+            <w:shd w:fill="F8FAFC"/>
+          </w:tcPr>
+          <w:p>
+            <w:pPr>
+              <w:spacing w:before="40" w:after="40"/>
+            </w:pPr>
+            <w:r>
+              <w:rPr>
+                <w:rFonts w:ascii="Segoe UI" w:hAnsi="Segoe UI"/>
+                <w:sz w:val="18"/>
+              </w:rPr>
+              <w:t>YYYY-MM-DD</w:t>
+            </w:r>
+          </w:p>
+        </w:tc>
+        <w:tc>
+          <w:tcPr>
+            <w:tcW w:type="dxa" w:w="1608"/>
+            <w:tcMar>
+              <w:top w:w="65" w:type="dxa"/>
+              <w:bottom w:w="65" w:type="dxa"/>
+              <w:left w:w="95" w:type="dxa"/>
+              <w:right w:w="95" w:type="dxa"/>
+            </w:tcMar>
+            <w:shd w:fill="F8FAFC"/>
+          </w:tcPr>
+          <w:p>
+            <w:pPr>
+              <w:spacing w:before="40" w:after="40"/>
+            </w:pPr>
+            <w:r>
+              <w:rPr>
+                <w:rFonts w:ascii="Segoe UI" w:hAnsi="Segoe UI"/>
+                <w:sz w:val="18"/>
+              </w:rPr>
+              <w:t>Test Suite Pass</w:t>
+            </w:r>
+          </w:p>
+        </w:tc>
+      </w:tr>
+      <w:tr>
+        <w:tc>
+          <w:tcPr>
+            <w:tcW w:type="dxa" w:w="1608"/>
+            <w:tcMar>
+              <w:top w:w="65" w:type="dxa"/>
+              <w:bottom w:w="65" w:type="dxa"/>
+              <w:left w:w="95" w:type="dxa"/>
+              <w:right w:w="95" w:type="dxa"/>
+            </w:tcMar>
+            <w:shd w:fill="FFFFFF"/>
+          </w:tcPr>
+          <w:p>
+            <w:pPr>
+              <w:spacing w:before="40" w:after="40"/>
+            </w:pPr>
+            <w:r>
+              <w:rPr>
+                <w:rFonts w:ascii="Segoe UI" w:hAnsi="Segoe UI"/>
+                <w:b/>
+                <w:sz w:val="18"/>
+              </w:rPr>
+              <w:t>4. Product Owner Acceptance</w:t>
+            </w:r>
+          </w:p>
+        </w:tc>
+        <w:tc>
+          <w:tcPr>
+            <w:tcW w:type="dxa" w:w="1608"/>
+            <w:tcMar>
+              <w:top w:w="65" w:type="dxa"/>
+              <w:bottom w:w="65" w:type="dxa"/>
+              <w:left w:w="95" w:type="dxa"/>
+              <w:right w:w="95" w:type="dxa"/>
+            </w:tcMar>
+            <w:shd w:fill="FFFFFF"/>
+          </w:tcPr>
+          <w:p>
+            <w:pPr>
+              <w:spacing w:before="40" w:after="40"/>
+            </w:pPr>
+            <w:r>
+              <w:rPr>
+                <w:rFonts w:ascii="Segoe UI" w:hAnsi="Segoe UI"/>
+                <w:sz w:val="18"/>
+              </w:rPr>
+              <w:t>Product Owner</w:t>
+            </w:r>
+          </w:p>
+        </w:tc>
+        <w:tc>
+          <w:tcPr>
+            <w:tcW w:type="dxa" w:w="1608"/>
+            <w:tcMar>
+              <w:top w:w="65" w:type="dxa"/>
+              <w:bottom w:w="65" w:type="dxa"/>
+              <w:left w:w="95" w:type="dxa"/>
+              <w:right w:w="95" w:type="dxa"/>
+            </w:tcMar>
+            <w:shd w:fill="FFFFFF"/>
+          </w:tcPr>
+          <w:p>
+            <w:pPr>
+              <w:spacing w:before="40" w:after="40"/>
+            </w:pPr>
+            <w:r>
+              <w:rPr>
+                <w:rFonts w:ascii="Segoe UI" w:hAnsi="Segoe UI"/>
+                <w:sz w:val="18"/>
+              </w:rPr>
+              <w:t>[ ] PENDING / [x] APPROVED</w:t>
+            </w:r>
+          </w:p>
+        </w:tc>
+        <w:tc>
+          <w:tcPr>
+            <w:tcW w:type="dxa" w:w="1608"/>
+            <w:tcMar>
+              <w:top w:w="65" w:type="dxa"/>
+              <w:bottom w:w="65" w:type="dxa"/>
+              <w:left w:w="95" w:type="dxa"/>
+              <w:right w:w="95" w:type="dxa"/>
+            </w:tcMar>
+            <w:shd w:fill="FFFFFF"/>
+          </w:tcPr>
+          <w:p>
+            <w:pPr>
+              <w:spacing w:before="40" w:after="40"/>
+            </w:pPr>
+            <w:r>
+              <w:rPr>
+                <w:rFonts w:ascii="Segoe UI" w:hAnsi="Segoe UI"/>
+                <w:sz w:val="18"/>
+              </w:rPr>
+              <w:t>@po-lead</w:t>
+            </w:r>
+          </w:p>
+        </w:tc>
+        <w:tc>
+          <w:tcPr>
+            <w:tcW w:type="dxa" w:w="1608"/>
+            <w:tcMar>
+              <w:top w:w="65" w:type="dxa"/>
+              <w:bottom w:w="65" w:type="dxa"/>
+              <w:left w:w="95" w:type="dxa"/>
+              <w:right w:w="95" w:type="dxa"/>
+            </w:tcMar>
+            <w:shd w:fill="FFFFFF"/>
+          </w:tcPr>
+          <w:p>
+            <w:pPr>
+              <w:spacing w:before="40" w:after="40"/>
+            </w:pPr>
+            <w:r>
+              <w:rPr>
+                <w:rFonts w:ascii="Segoe UI" w:hAnsi="Segoe UI"/>
+                <w:sz w:val="18"/>
+              </w:rPr>
+              <w:t>YYYY-MM-DD</w:t>
+            </w:r>
+          </w:p>
+        </w:tc>
+        <w:tc>
+          <w:tcPr>
+            <w:tcW w:type="dxa" w:w="1608"/>
+            <w:tcMar>
+              <w:top w:w="65" w:type="dxa"/>
+              <w:bottom w:w="65" w:type="dxa"/>
+              <w:left w:w="95" w:type="dxa"/>
+              <w:right w:w="95" w:type="dxa"/>
+            </w:tcMar>
+            <w:shd w:fill="FFFFFF"/>
+          </w:tcPr>
+          <w:p>
+            <w:pPr>
+              <w:spacing w:before="40" w:after="40"/>
+            </w:pPr>
+            <w:r>
+              <w:rPr>
+                <w:rFonts w:ascii="Segoe UI" w:hAnsi="Segoe UI"/>
+                <w:sz w:val="18"/>
+              </w:rPr>
+              <w:t>Confluence PRD</w:t>
+            </w:r>
+          </w:p>
+        </w:tc>
+      </w:tr>
+      <w:tr>
+        <w:tc>
+          <w:tcPr>
+            <w:tcW w:type="dxa" w:w="1608"/>
+            <w:tcMar>
+              <w:top w:w="65" w:type="dxa"/>
+              <w:bottom w:w="65" w:type="dxa"/>
+              <w:left w:w="95" w:type="dxa"/>
+              <w:right w:w="95" w:type="dxa"/>
+            </w:tcMar>
+            <w:shd w:fill="F8FAFC"/>
+          </w:tcPr>
+          <w:p>
+            <w:pPr>
+              <w:spacing w:before="40" w:after="40"/>
+            </w:pPr>
+            <w:r>
+              <w:rPr>
+                <w:rFonts w:ascii="Segoe UI" w:hAnsi="Segoe UI"/>
+                <w:b/>
+                <w:sz w:val="18"/>
+              </w:rPr>
+              <w:t>5. Confluence SSOT Sync</w:t>
+            </w:r>
+          </w:p>
+        </w:tc>
+        <w:tc>
+          <w:tcPr>
+            <w:tcW w:type="dxa" w:w="1608"/>
+            <w:tcMar>
+              <w:top w:w="65" w:type="dxa"/>
+              <w:bottom w:w="65" w:type="dxa"/>
+              <w:left w:w="95" w:type="dxa"/>
+              <w:right w:w="95" w:type="dxa"/>
+            </w:tcMar>
+            <w:shd w:fill="F8FAFC"/>
+          </w:tcPr>
+          <w:p>
+            <w:pPr>
+              <w:spacing w:before="40" w:after="40"/>
+            </w:pPr>
+            <w:r>
+              <w:rPr>
+                <w:rFonts w:ascii="Segoe UI" w:hAnsi="Segoe UI"/>
+                <w:sz w:val="18"/>
+              </w:rPr>
+              <w:t>Technical Author</w:t>
+            </w:r>
+          </w:p>
+        </w:tc>
+        <w:tc>
+          <w:tcPr>
+            <w:tcW w:type="dxa" w:w="1608"/>
+            <w:tcMar>
+              <w:top w:w="65" w:type="dxa"/>
+              <w:bottom w:w="65" w:type="dxa"/>
+              <w:left w:w="95" w:type="dxa"/>
+              <w:right w:w="95" w:type="dxa"/>
+            </w:tcMar>
+            <w:shd w:fill="F8FAFC"/>
+          </w:tcPr>
+          <w:p>
+            <w:pPr>
+              <w:spacing w:before="40" w:after="40"/>
+            </w:pPr>
+            <w:r>
+              <w:rPr>
+                <w:rFonts w:ascii="Segoe UI" w:hAnsi="Segoe UI"/>
+                <w:sz w:val="18"/>
+              </w:rPr>
+              <w:t>[ ] PENDING / [x] APPROVED</w:t>
+            </w:r>
+          </w:p>
+        </w:tc>
+        <w:tc>
+          <w:tcPr>
+            <w:tcW w:type="dxa" w:w="1608"/>
+            <w:tcMar>
+              <w:top w:w="65" w:type="dxa"/>
+              <w:bottom w:w="65" w:type="dxa"/>
+              <w:left w:w="95" w:type="dxa"/>
+              <w:right w:w="95" w:type="dxa"/>
+            </w:tcMar>
+            <w:shd w:fill="F8FAFC"/>
+          </w:tcPr>
+          <w:p>
+            <w:pPr>
+              <w:spacing w:before="40" w:after="40"/>
+            </w:pPr>
+            <w:r>
+              <w:rPr>
+                <w:rFonts w:ascii="Segoe UI" w:hAnsi="Segoe UI"/>
+                <w:sz w:val="18"/>
+              </w:rPr>
+              <w:t>@tech-writer</w:t>
+            </w:r>
+          </w:p>
+        </w:tc>
+        <w:tc>
+          <w:tcPr>
+            <w:tcW w:type="dxa" w:w="1608"/>
+            <w:tcMar>
+              <w:top w:w="65" w:type="dxa"/>
+              <w:bottom w:w="65" w:type="dxa"/>
+              <w:left w:w="95" w:type="dxa"/>
+              <w:right w:w="95" w:type="dxa"/>
+            </w:tcMar>
+            <w:shd w:fill="F8FAFC"/>
+          </w:tcPr>
+          <w:p>
+            <w:pPr>
+              <w:spacing w:before="40" w:after="40"/>
+            </w:pPr>
+            <w:r>
+              <w:rPr>
+                <w:rFonts w:ascii="Segoe UI" w:hAnsi="Segoe UI"/>
+                <w:sz w:val="18"/>
+              </w:rPr>
+              <w:t>YYYY-MM-DD</w:t>
+            </w:r>
+          </w:p>
+        </w:tc>
+        <w:tc>
+          <w:tcPr>
+            <w:tcW w:type="dxa" w:w="1608"/>
+            <w:tcMar>
+              <w:top w:w="65" w:type="dxa"/>
+              <w:bottom w:w="65" w:type="dxa"/>
+              <w:left w:w="95" w:type="dxa"/>
+              <w:right w:w="95" w:type="dxa"/>
+            </w:tcMar>
+            <w:shd w:fill="F8FAFC"/>
+          </w:tcPr>
+          <w:p>
+            <w:pPr>
+              <w:spacing w:before="40" w:after="40"/>
+            </w:pPr>
+            <w:r>
+              <w:rPr>
+                <w:rFonts w:ascii="Segoe UI" w:hAnsi="Segoe UI"/>
+                <w:sz w:val="18"/>
+              </w:rPr>
+              <w:t>Space SCRUM</w:t>
+            </w:r>
+          </w:p>
+        </w:tc>
+      </w:tr>
+    </w:tbl>
+    <w:p>
+      <w:pPr>
+        <w:spacing w:after="80"/>
+      </w:pPr>
+    </w:p>
+    <w:p>
+      <w:pPr>
+        <w:keepNext/>
+        <w:spacing w:before="200" w:after="60"/>
+      </w:pPr>
+      <w:r>
+        <w:rPr>
+          <w:rFonts w:ascii="Segoe UI" w:hAnsi="Segoe UI"/>
+          <w:b/>
+          <w:color w:val="FF7F6C"/>
+          <w:sz w:val="22"/>
+        </w:rPr>
+        <w:t>Mandatory Review Checklist:</w:t>
+      </w:r>
+    </w:p>
+    <w:p>
+      <w:pPr>
+        <w:pStyle w:val="ListBullet"/>
+        <w:spacing w:before="20" w:after="40"/>
+      </w:pPr>
+      <w:r>
+        <w:rPr>
+          <w:rFonts w:ascii="Segoe UI" w:hAnsi="Segoe UI"/>
+        </w:rPr>
+        <w:t xml:space="preserve">[ ] </w:t>
+      </w:r>
+      <w:r>
+        <w:rPr>
+          <w:rFonts w:ascii="Segoe UI" w:hAnsi="Segoe UI"/>
+          <w:b/>
+        </w:rPr>
+        <w:t>Debit / Credit Invariant:</w:t>
+      </w:r>
+      <w:r>
+        <w:rPr>
+          <w:rFonts w:ascii="Segoe UI" w:hAnsi="Segoe UI"/>
+        </w:rPr>
+        <w:t xml:space="preserve"> Balanced entries verified (</w:t>
+      </w:r>
+      <w:r>
+        <w:rPr>
+          <w:rFonts w:ascii="Consolas" w:hAnsi="Consolas"/>
+          <w:color w:val="B42828"/>
+          <w:sz w:val="19"/>
+        </w:rPr>
+        <w:t>sum(debits) === sum(credits)</w:t>
+      </w:r>
+      <w:r>
+        <w:rPr>
+          <w:rFonts w:ascii="Segoe UI" w:hAnsi="Segoe UI"/>
+        </w:rPr>
+        <w:t>).</w:t>
+      </w:r>
+    </w:p>
+    <w:p>
+      <w:pPr>
+        <w:pStyle w:val="ListBullet"/>
+        <w:spacing w:before="20" w:after="40"/>
+      </w:pPr>
+      <w:r>
+        <w:rPr>
+          <w:rFonts w:ascii="Segoe UI" w:hAnsi="Segoe UI"/>
+        </w:rPr>
+        <w:t xml:space="preserve">[ ] </w:t>
+      </w:r>
+      <w:r>
+        <w:rPr>
+          <w:rFonts w:ascii="Segoe UI" w:hAnsi="Segoe UI"/>
+          <w:b/>
+        </w:rPr>
+        <w:t>Zero Float Leakage:</w:t>
+      </w:r>
+      <w:r>
+        <w:rPr>
+          <w:rFonts w:ascii="Segoe UI" w:hAnsi="Segoe UI"/>
+        </w:rPr>
+        <w:t xml:space="preserve"> All calculations use </w:t>
+      </w:r>
+      <w:r>
+        <w:rPr>
+          <w:rFonts w:ascii="Consolas" w:hAnsi="Consolas"/>
+          <w:color w:val="B42828"/>
+          <w:sz w:val="19"/>
+        </w:rPr>
+        <w:t>MoneyService</w:t>
+      </w:r>
+      <w:r>
+        <w:rPr>
+          <w:rFonts w:ascii="Segoe UI" w:hAnsi="Segoe UI"/>
+        </w:rPr>
+        <w:t xml:space="preserve"> (PostgreSQL </w:t>
+      </w:r>
+      <w:r>
+        <w:rPr>
+          <w:rFonts w:ascii="Consolas" w:hAnsi="Consolas"/>
+          <w:color w:val="B42828"/>
+          <w:sz w:val="19"/>
+        </w:rPr>
+        <w:t>NUMERIC(19,4)</w:t>
+      </w:r>
+      <w:r>
+        <w:rPr>
+          <w:rFonts w:ascii="Segoe UI" w:hAnsi="Segoe UI"/>
+        </w:rPr>
+        <w:t>).</w:t>
+      </w:r>
+    </w:p>
+    <w:p>
+      <w:pPr>
+        <w:pStyle w:val="ListBullet"/>
+        <w:spacing w:before="20" w:after="40"/>
+      </w:pPr>
+      <w:r>
+        <w:rPr>
+          <w:rFonts w:ascii="Segoe UI" w:hAnsi="Segoe UI"/>
+        </w:rPr>
+        <w:t xml:space="preserve">[ ] </w:t>
+      </w:r>
+      <w:r>
+        <w:rPr>
+          <w:rFonts w:ascii="Segoe UI" w:hAnsi="Segoe UI"/>
+          <w:b/>
+        </w:rPr>
+        <w:t>Multi-Tenant Isolation:</w:t>
+      </w:r>
+      <w:r>
+        <w:rPr>
+          <w:rFonts w:ascii="Segoe UI" w:hAnsi="Segoe UI"/>
+        </w:rPr>
+        <w:t xml:space="preserve"> Explicit </w:t>
+      </w:r>
+      <w:r>
+        <w:rPr>
+          <w:rFonts w:ascii="Consolas" w:hAnsi="Consolas"/>
+          <w:color w:val="B42828"/>
+          <w:sz w:val="19"/>
+        </w:rPr>
+        <w:t>organizationId</w:t>
+      </w:r>
+      <w:r>
+        <w:rPr>
+          <w:rFonts w:ascii="Segoe UI" w:hAnsi="Segoe UI"/>
+        </w:rPr>
+        <w:t xml:space="preserve"> scoping enforced on every query.</w:t>
+      </w:r>
+    </w:p>
+    <w:p>
+      <w:pPr>
+        <w:pStyle w:val="ListBullet"/>
+        <w:spacing w:before="20" w:after="40"/>
+      </w:pPr>
+      <w:r>
+        <w:rPr>
+          <w:rFonts w:ascii="Segoe UI" w:hAnsi="Segoe UI"/>
+        </w:rPr>
+        <w:t xml:space="preserve">[ ] </w:t>
+      </w:r>
+      <w:r>
+        <w:rPr>
+          <w:rFonts w:ascii="Segoe UI" w:hAnsi="Segoe UI"/>
+          <w:b/>
+        </w:rPr>
+        <w:t>Audit Trail:</w:t>
+      </w:r>
+      <w:r>
+        <w:rPr>
+          <w:rFonts w:ascii="Segoe UI" w:hAnsi="Segoe UI"/>
+        </w:rPr>
+        <w:t xml:space="preserve"> Immutable audit event emitted for state-mutating actions.</w:t>
+      </w:r>
+    </w:p>
+    <w:p>
+      <w:pPr>
+        <w:pStyle w:val="ListBullet"/>
+        <w:spacing w:before="20" w:after="40"/>
+      </w:pPr>
+      <w:r>
+        <w:rPr>
+          <w:rFonts w:ascii="Segoe UI" w:hAnsi="Segoe UI"/>
+        </w:rPr>
+        <w:t xml:space="preserve">[ ] </w:t>
+      </w:r>
+      <w:r>
+        <w:rPr>
+          <w:rFonts w:ascii="Segoe UI" w:hAnsi="Segoe UI"/>
+          <w:b/>
+        </w:rPr>
+        <w:t>Confluence Documentation:</w:t>
+      </w:r>
+      <w:r>
+        <w:rPr>
+          <w:rFonts w:ascii="Segoe UI" w:hAnsi="Segoe UI"/>
+        </w:rPr>
+        <w:t xml:space="preserve"> Linked to corresponding PRD or Technical Specification in Space </w:t>
+      </w:r>
+      <w:r>
+        <w:rPr>
+          <w:rFonts w:ascii="Consolas" w:hAnsi="Consolas"/>
+          <w:color w:val="B42828"/>
+          <w:sz w:val="19"/>
+        </w:rPr>
+        <w:t>SCRUM</w:t>
+      </w:r>
+      <w:r>
+        <w:rPr>
+          <w:rFonts w:ascii="Segoe UI" w:hAnsi="Segoe UI"/>
+        </w:rPr>
+        <w:t>.</w:t>
+      </w:r>
     </w:p>
     <w:p>
       <w:pPr>

</xml_diff>